<commit_message>
Actualización de documentos del expediente
</commit_message>
<xml_diff>
--- a/H2/H2-SOLID-antes-despues.docx
+++ b/H2/H2-SOLID-antes-despues.docx
@@ -381,103 +381,7 @@
           <w:sz w:val="24"/>
           <w:szCs w:val="24"/>
         </w:rPr>
-        <w:t xml:space="preserve">Este hito parte del diagrama del H1: primero muestro el </w:t>
-      </w:r>
-      <w:r>
-        <w:rPr>
-          <w:rFonts w:ascii="Arial" w:eastAsia="Calibri" w:hAnsi="Arial" w:cs="Arial"/>
-          <w:sz w:val="24"/>
-          <w:szCs w:val="24"/>
-        </w:rPr>
-        <w:t>diseño</w:t>
-      </w:r>
-      <w:r>
-        <w:rPr>
-          <w:rFonts w:ascii="Arial" w:eastAsia="Calibri" w:hAnsi="Arial" w:cs="Arial"/>
-          <w:sz w:val="24"/>
-          <w:szCs w:val="24"/>
-        </w:rPr>
-        <w:t xml:space="preserve"> tal como lo entregue, con sus problemas </w:t>
-      </w:r>
-      <w:r>
-        <w:rPr>
-          <w:rFonts w:ascii="Arial" w:eastAsia="Calibri" w:hAnsi="Arial" w:cs="Arial"/>
-          <w:sz w:val="24"/>
-          <w:szCs w:val="24"/>
-        </w:rPr>
-        <w:t>señalados</w:t>
-      </w:r>
-      <w:r>
-        <w:rPr>
-          <w:rFonts w:ascii="Arial" w:eastAsia="Calibri" w:hAnsi="Arial" w:cs="Arial"/>
-          <w:sz w:val="24"/>
-          <w:szCs w:val="24"/>
-        </w:rPr>
-        <w:t xml:space="preserve"> uno por uno, y </w:t>
-      </w:r>
-      <w:r>
-        <w:rPr>
-          <w:rFonts w:ascii="Arial" w:eastAsia="Calibri" w:hAnsi="Arial" w:cs="Arial"/>
-          <w:sz w:val="24"/>
-          <w:szCs w:val="24"/>
-        </w:rPr>
-        <w:t>recién</w:t>
-      </w:r>
-      <w:r>
-        <w:rPr>
-          <w:rFonts w:ascii="Arial" w:eastAsia="Calibri" w:hAnsi="Arial" w:cs="Arial"/>
-          <w:sz w:val="24"/>
-          <w:szCs w:val="24"/>
-        </w:rPr>
-        <w:t xml:space="preserve"> </w:t>
-      </w:r>
-      <w:r>
-        <w:rPr>
-          <w:rFonts w:ascii="Arial" w:eastAsia="Calibri" w:hAnsi="Arial" w:cs="Arial"/>
-          <w:sz w:val="24"/>
-          <w:szCs w:val="24"/>
-        </w:rPr>
-        <w:t>después</w:t>
-      </w:r>
-      <w:r>
-        <w:rPr>
-          <w:rFonts w:ascii="Arial" w:eastAsia="Calibri" w:hAnsi="Arial" w:cs="Arial"/>
-          <w:sz w:val="24"/>
-          <w:szCs w:val="24"/>
-        </w:rPr>
-        <w:t xml:space="preserve"> el refactor. Cada cambio del "</w:t>
-      </w:r>
-      <w:r>
-        <w:rPr>
-          <w:rFonts w:ascii="Arial" w:eastAsia="Calibri" w:hAnsi="Arial" w:cs="Arial"/>
-          <w:sz w:val="24"/>
-          <w:szCs w:val="24"/>
-        </w:rPr>
-        <w:t>después</w:t>
-      </w:r>
-      <w:r>
-        <w:rPr>
-          <w:rFonts w:ascii="Arial" w:eastAsia="Calibri" w:hAnsi="Arial" w:cs="Arial"/>
-          <w:sz w:val="24"/>
-          <w:szCs w:val="24"/>
-        </w:rPr>
-        <w:t xml:space="preserve">" </w:t>
-      </w:r>
-      <w:r>
-        <w:rPr>
-          <w:rFonts w:ascii="Arial" w:eastAsia="Calibri" w:hAnsi="Arial" w:cs="Arial"/>
-          <w:sz w:val="24"/>
-          <w:szCs w:val="24"/>
-        </w:rPr>
-        <w:t>está</w:t>
-      </w:r>
-      <w:r>
-        <w:rPr>
-          <w:rFonts w:ascii="Arial" w:eastAsia="Calibri" w:hAnsi="Arial" w:cs="Arial"/>
-          <w:sz w:val="24"/>
-          <w:szCs w:val="24"/>
-        </w:rPr>
-        <w:t xml:space="preserve"> atado a un principio y a una regla real del taller.</w:t>
+        <w:t>Este hito parte del diagrama del H1: primero muestro el diseño tal como lo entregue, con sus problemas señalados uno por uno, y recién después el refactor. Cada cambio del "después" está atado a un principio y a una regla real del taller.</w:t>
       </w:r>
     </w:p>
     <w:p>
@@ -649,7 +553,23 @@
           <w:sz w:val="24"/>
           <w:szCs w:val="24"/>
         </w:rPr>
-        <w:t xml:space="preserve"> Diagrama de lases entregado en H1</w:t>
+        <w:t xml:space="preserve"> Diagrama de </w:t>
+      </w:r>
+      <w:r>
+        <w:rPr>
+          <w:rFonts w:ascii="Arial" w:hAnsi="Arial" w:cs="Arial"/>
+          <w:sz w:val="24"/>
+          <w:szCs w:val="24"/>
+        </w:rPr>
+        <w:t>c</w:t>
+      </w:r>
+      <w:r>
+        <w:rPr>
+          <w:rFonts w:ascii="Arial" w:hAnsi="Arial" w:cs="Arial"/>
+          <w:sz w:val="24"/>
+          <w:szCs w:val="24"/>
+        </w:rPr>
+        <w:t>lases entregado en H1</w:t>
       </w:r>
     </w:p>
     <w:p>

</xml_diff>